<commit_message>
Portabilité : marche chez n'importe qui à la réception
- ensure_deps robuste : essai pip normal puis repli --break-system-packages
  (ne plante plus sur un pip ancien / un autre environnement)
- start.bat détecte l'absence de Python et donne un message clair
- README : prérequis destinataire + note "envoyer à quelqu'un"
- doc de rendu régénéré

Co-Authored-By: Claude Opus 4.8 <noreply@anthropic.com>
</commit_message>
<xml_diff>
--- a/RENDU_COMPLET.docx
+++ b/RENDU_COMPLET.docx
@@ -171,7 +171,7 @@
       </w:r>
     </w:p>
     <w:bookmarkEnd w:id="9"/>
-    <w:bookmarkStart w:id="26" w:name="présentation-du-projet"/>
+    <w:bookmarkStart w:id="27" w:name="présentation-du-projet"/>
     <w:p>
       <w:pPr>
         <w:pStyle w:val="Heading1"/>
@@ -180,7 +180,7 @@
         <w:t xml:space="preserve">1. Présentation du projet</w:t>
       </w:r>
     </w:p>
-    <w:bookmarkStart w:id="25" w:name="techcorp-ai-phi-3.5-financial-chat"/>
+    <w:bookmarkStart w:id="26" w:name="techcorp-ai-phi-3.5-financial-chat"/>
     <w:p>
       <w:pPr>
         <w:pStyle w:val="Heading2"/>
@@ -356,7 +356,7 @@
         </w:pict>
       </w:r>
     </w:p>
-    <w:bookmarkStart w:id="13" w:name="démarrage-en-1-étape"/>
+    <w:bookmarkStart w:id="14" w:name="démarrage-en-1-étape"/>
     <w:p>
       <w:pPr>
         <w:pStyle w:val="Heading3"/>
@@ -374,6 +374,80 @@
           <w:b/>
           <w:bCs/>
         </w:rPr>
+        <w:t xml:space="preserve">Prérequis (destinataire)</w:t>
+      </w:r>
+      <w:r>
+        <w:t xml:space="preserve"> </w:t>
+      </w:r>
+      <w:r>
+        <w:t xml:space="preserve">: Windows +</w:t>
+      </w:r>
+      <w:r>
+        <w:t xml:space="preserve"> </w:t>
+      </w:r>
+      <w:r>
+        <w:rPr>
+          <w:b/>
+          <w:bCs/>
+        </w:rPr>
+        <w:t xml:space="preserve">Python 3.x</w:t>
+      </w:r>
+      <w:r>
+        <w:t xml:space="preserve"> </w:t>
+      </w:r>
+      <w:r>
+        <w:t xml:space="preserve">(</w:t>
+      </w:r>
+      <w:hyperlink r:id="rId13">
+        <w:r>
+          <w:rPr>
+            <w:rStyle w:val="Hyperlink"/>
+          </w:rPr>
+          <w:t xml:space="preserve">python.org</w:t>
+        </w:r>
+      </w:hyperlink>
+      <w:r>
+        <w:t xml:space="preserve"> </w:t>
+      </w:r>
+      <w:r>
+        <w:t xml:space="preserve">— cocher</w:t>
+      </w:r>
+      <w:r>
+        <w:t xml:space="preserve"> </w:t>
+      </w:r>
+      <w:r>
+        <w:rPr>
+          <w:i/>
+          <w:iCs/>
+        </w:rPr>
+        <w:t xml:space="preserve">« Add Python to PATH »</w:t>
+      </w:r>
+      <w:r>
+        <w:t xml:space="preserve">). C’est tout : le reste (dépendances,</w:t>
+      </w:r>
+      <w:r>
+        <w:t xml:space="preserve"> </w:t>
+      </w:r>
+      <w:r>
+        <w:rPr>
+          <w:b/>
+          <w:bCs/>
+        </w:rPr>
+        <w:t xml:space="preserve">Ollama</w:t>
+      </w:r>
+      <w:r>
+        <w:t xml:space="preserve">, modèle) s’installe automatiquement au premier lancement.</w:t>
+      </w:r>
+    </w:p>
+    <w:p>
+      <w:pPr>
+        <w:pStyle w:val="BodyText"/>
+      </w:pPr>
+      <w:r>
+        <w:rPr>
+          <w:b/>
+          <w:bCs/>
+        </w:rPr>
         <w:t xml:space="preserve">Double-cliquez sur</w:t>
       </w:r>
       <w:r>
@@ -482,6 +556,45 @@
       </w:r>
       <w:r>
         <w:t xml:space="preserve">.</w:t>
+      </w:r>
+    </w:p>
+    <w:p>
+      <w:pPr>
+        <w:pStyle w:val="BlockText"/>
+      </w:pPr>
+      <w:r>
+        <w:t xml:space="preserve">📦</w:t>
+      </w:r>
+      <w:r>
+        <w:t xml:space="preserve"> </w:t>
+      </w:r>
+      <w:r>
+        <w:rPr>
+          <w:b/>
+          <w:bCs/>
+        </w:rPr>
+        <w:t xml:space="preserve">Pour envoyer à quelqu’un</w:t>
+      </w:r>
+      <w:r>
+        <w:t xml:space="preserve"> </w:t>
+      </w:r>
+      <w:r>
+        <w:t xml:space="preserve">: transmettez le ZIP du projet (ou le lien GitHub). Le destinataire dézippe et double-clique</w:t>
+      </w:r>
+      <w:r>
+        <w:t xml:space="preserve"> </w:t>
+      </w:r>
+      <w:r>
+        <w:rPr>
+          <w:rStyle w:val="VerbatimChar"/>
+        </w:rPr>
+        <w:t xml:space="preserve">start.bat</w:t>
+      </w:r>
+      <w:r>
+        <w:t xml:space="preserve"> </w:t>
+      </w:r>
+      <w:r>
+        <w:t xml:space="preserve">— aucun réglage propre à votre PC n’est requis.</w:t>
       </w:r>
     </w:p>
     <w:p>
@@ -491,8 +604,8 @@
         </w:pict>
       </w:r>
     </w:p>
-    <w:bookmarkEnd w:id="13"/>
-    <w:bookmarkStart w:id="15" w:name="Xe06dcdf35b0f5ce85c72bb3ba86d4c8974241f2"/>
+    <w:bookmarkEnd w:id="14"/>
+    <w:bookmarkStart w:id="16" w:name="Xe06dcdf35b0f5ce85c72bb3ba86d4c8974241f2"/>
     <w:p>
       <w:pPr>
         <w:pStyle w:val="Heading3"/>
@@ -666,7 +779,7 @@
         <w:t xml:space="preserve">(vert).</w:t>
       </w:r>
     </w:p>
-    <w:bookmarkStart w:id="14" w:name="ou-via-docker"/>
+    <w:bookmarkStart w:id="15" w:name="ou-via-docker"/>
     <w:p>
       <w:pPr>
         <w:pStyle w:val="Heading4"/>
@@ -726,9 +839,9 @@
         </w:pict>
       </w:r>
     </w:p>
-    <w:bookmarkEnd w:id="14"/>
     <w:bookmarkEnd w:id="15"/>
-    <w:bookmarkStart w:id="16" w:name="fonctionnalités"/>
+    <w:bookmarkEnd w:id="16"/>
+    <w:bookmarkStart w:id="17" w:name="fonctionnalités"/>
     <w:p>
       <w:pPr>
         <w:pStyle w:val="Heading3"/>
@@ -926,8 +1039,8 @@
         </w:pict>
       </w:r>
     </w:p>
-    <w:bookmarkEnd w:id="16"/>
-    <w:bookmarkStart w:id="17" w:name="architecture"/>
+    <w:bookmarkEnd w:id="17"/>
+    <w:bookmarkStart w:id="18" w:name="architecture"/>
     <w:p>
       <w:pPr>
         <w:pStyle w:val="Heading3"/>
@@ -1065,8 +1178,8 @@
         </w:pict>
       </w:r>
     </w:p>
-    <w:bookmarkEnd w:id="17"/>
-    <w:bookmarkStart w:id="18" w:name="structure-filières"/>
+    <w:bookmarkEnd w:id="18"/>
+    <w:bookmarkStart w:id="19" w:name="structure-filières"/>
     <w:p>
       <w:pPr>
         <w:pStyle w:val="Heading3"/>
@@ -1465,8 +1578,8 @@
         </w:pict>
       </w:r>
     </w:p>
-    <w:bookmarkEnd w:id="18"/>
-    <w:bookmarkStart w:id="19" w:name="tests-validation"/>
+    <w:bookmarkEnd w:id="19"/>
+    <w:bookmarkStart w:id="20" w:name="tests-validation"/>
     <w:p>
       <w:pPr>
         <w:pStyle w:val="Heading3"/>
@@ -1621,8 +1734,8 @@
         <w:t xml:space="preserve"># Intégrité + pip-audit (CYBER)</w:t>
       </w:r>
     </w:p>
-    <w:bookmarkEnd w:id="19"/>
-    <w:bookmarkStart w:id="20" w:name="fine-tuning-médical-rd"/>
+    <w:bookmarkEnd w:id="20"/>
+    <w:bookmarkStart w:id="21" w:name="fine-tuning-médical-rd"/>
     <w:p>
       <w:pPr>
         <w:pStyle w:val="Heading3"/>
@@ -1696,8 +1809,8 @@
         <w:t xml:space="preserve"># Pleine échelle (GPU) : fine_tuning/finetune_colab.ipynb dans Google Colab</w:t>
       </w:r>
     </w:p>
-    <w:bookmarkEnd w:id="20"/>
-    <w:bookmarkStart w:id="24" w:name="documentation"/>
+    <w:bookmarkEnd w:id="21"/>
+    <w:bookmarkStart w:id="25" w:name="documentation"/>
     <w:p>
       <w:pPr>
         <w:pStyle w:val="Heading3"/>
@@ -1720,7 +1833,7 @@
       <w:r>
         <w:t xml:space="preserve"> </w:t>
       </w:r>
-      <w:hyperlink r:id="rId21">
+      <w:hyperlink r:id="rId22">
         <w:r>
           <w:rPr>
             <w:rStyle w:val="Hyperlink"/>
@@ -1751,7 +1864,7 @@
       <w:r>
         <w:t xml:space="preserve"> </w:t>
       </w:r>
-      <w:hyperlink r:id="rId22">
+      <w:hyperlink r:id="rId23">
         <w:r>
           <w:rPr>
             <w:rStyle w:val="Hyperlink"/>
@@ -1782,7 +1895,7 @@
       <w:r>
         <w:t xml:space="preserve"> </w:t>
       </w:r>
-      <w:hyperlink r:id="rId23">
+      <w:hyperlink r:id="rId24">
         <w:r>
           <w:rPr>
             <w:rStyle w:val="Hyperlink"/>
@@ -1804,10 +1917,10 @@
         <w:br w:type="page"/>
       </w:r>
     </w:p>
-    <w:bookmarkEnd w:id="24"/>
     <w:bookmarkEnd w:id="25"/>
     <w:bookmarkEnd w:id="26"/>
-    <w:bookmarkStart w:id="56" w:name="dossier-de-rendu-synthèse-livrables"/>
+    <w:bookmarkEnd w:id="27"/>
+    <w:bookmarkStart w:id="57" w:name="dossier-de-rendu-synthèse-livrables"/>
     <w:p>
       <w:pPr>
         <w:pStyle w:val="Heading1"/>
@@ -1816,7 +1929,7 @@
         <w:t xml:space="preserve">2. Dossier de rendu (synthèse &amp; livrables)</w:t>
       </w:r>
     </w:p>
-    <w:bookmarkStart w:id="55" w:name="rendu-techcorp-ai-phi-3.5-financial-chat"/>
+    <w:bookmarkStart w:id="56" w:name="rendu-techcorp-ai-phi-3.5-financial-chat"/>
     <w:p>
       <w:pPr>
         <w:pStyle w:val="Heading2"/>
@@ -1994,7 +2107,7 @@
         </w:pict>
       </w:r>
     </w:p>
-    <w:bookmarkStart w:id="27" w:name="sommaire"/>
+    <w:bookmarkStart w:id="28" w:name="sommaire"/>
     <w:p>
       <w:pPr>
         <w:pStyle w:val="Heading3"/>
@@ -2146,8 +2259,8 @@
         </w:pict>
       </w:r>
     </w:p>
-    <w:bookmarkEnd w:id="27"/>
-    <w:bookmarkStart w:id="28" w:name="synthèse-exécutive"/>
+    <w:bookmarkEnd w:id="28"/>
+    <w:bookmarkStart w:id="29" w:name="synthèse-exécutive"/>
     <w:p>
       <w:pPr>
         <w:pStyle w:val="Heading3"/>
@@ -2596,8 +2709,8 @@
         </w:pict>
       </w:r>
     </w:p>
-    <w:bookmarkEnd w:id="28"/>
-    <w:bookmarkStart w:id="29" w:name="architecture-1"/>
+    <w:bookmarkEnd w:id="29"/>
+    <w:bookmarkStart w:id="30" w:name="architecture-1"/>
     <w:p>
       <w:pPr>
         <w:pStyle w:val="Heading3"/>
@@ -2797,8 +2910,8 @@
         </w:pict>
       </w:r>
     </w:p>
-    <w:bookmarkEnd w:id="29"/>
-    <w:bookmarkStart w:id="30" w:name="démarrage-rapide"/>
+    <w:bookmarkEnd w:id="30"/>
+    <w:bookmarkStart w:id="31" w:name="démarrage-rapide"/>
     <w:p>
       <w:pPr>
         <w:pStyle w:val="Heading3"/>
@@ -3055,8 +3168,8 @@
         </w:pict>
       </w:r>
     </w:p>
-    <w:bookmarkEnd w:id="30"/>
-    <w:bookmarkStart w:id="48" w:name="guide-détaillé-des-livrables"/>
+    <w:bookmarkEnd w:id="31"/>
+    <w:bookmarkStart w:id="49" w:name="guide-détaillé-des-livrables"/>
     <w:p>
       <w:pPr>
         <w:pStyle w:val="Heading3"/>
@@ -3102,7 +3215,7 @@
         <w:t xml:space="preserve">).</w:t>
       </w:r>
     </w:p>
-    <w:bookmarkStart w:id="31" w:name="mission-principale-interface-chat"/>
+    <w:bookmarkStart w:id="32" w:name="mission-principale-interface-chat"/>
     <w:p>
       <w:pPr>
         <w:pStyle w:val="Heading4"/>
@@ -3345,8 +3458,8 @@
         </w:pict>
       </w:r>
     </w:p>
-    <w:bookmarkEnd w:id="31"/>
-    <w:bookmarkStart w:id="38" w:name="X280f80f269af6e2912504a76a96da9263fb8980"/>
+    <w:bookmarkEnd w:id="32"/>
+    <w:bookmarkStart w:id="39" w:name="X280f80f269af6e2912504a76a96da9263fb8980"/>
     <w:p>
       <w:pPr>
         <w:pStyle w:val="Heading4"/>
@@ -3403,7 +3516,7 @@
       <w:r>
         <w:t xml:space="preserve"> </w:t>
       </w:r>
-      <w:hyperlink r:id="rId32">
+      <w:hyperlink r:id="rId33">
         <w:r>
           <w:rPr>
             <w:rStyle w:val="Hyperlink"/>
@@ -3798,7 +3911,7 @@
       <w:r>
         <w:t xml:space="preserve"> </w:t>
       </w:r>
-      <w:hyperlink r:id="rId33">
+      <w:hyperlink r:id="rId34">
         <w:r>
           <w:rPr>
             <w:rStyle w:val="Hyperlink"/>
@@ -3812,7 +3925,7 @@
       <w:r>
         <w:t xml:space="preserve"> </w:t>
       </w:r>
-      <w:hyperlink r:id="rId34">
+      <w:hyperlink r:id="rId35">
         <w:r>
           <w:rPr>
             <w:rStyle w:val="Hyperlink"/>
@@ -3826,7 +3939,7 @@
       <w:r>
         <w:t xml:space="preserve"> </w:t>
       </w:r>
-      <w:hyperlink r:id="rId35">
+      <w:hyperlink r:id="rId36">
         <w:r>
           <w:rPr>
             <w:rStyle w:val="Hyperlink"/>
@@ -3957,7 +4070,7 @@
         </w:rPr>
         <w:t xml:space="preserve"> </w:t>
       </w:r>
-      <w:hyperlink r:id="rId36">
+      <w:hyperlink r:id="rId37">
         <w:r>
           <w:rPr>
             <w:rStyle w:val="Hyperlink"/>
@@ -4066,7 +4179,7 @@
       <w:r>
         <w:t xml:space="preserve"> </w:t>
       </w:r>
-      <w:hyperlink r:id="rId37">
+      <w:hyperlink r:id="rId38">
         <w:r>
           <w:rPr>
             <w:rStyle w:val="Hyperlink"/>
@@ -4088,8 +4201,8 @@
         </w:pict>
       </w:r>
     </w:p>
-    <w:bookmarkEnd w:id="38"/>
-    <w:bookmarkStart w:id="40" w:name="dev-web-interface-complète"/>
+    <w:bookmarkEnd w:id="39"/>
+    <w:bookmarkStart w:id="41" w:name="dev-web-interface-complète"/>
     <w:p>
       <w:pPr>
         <w:pStyle w:val="Heading4"/>
@@ -4175,7 +4288,7 @@
       <w:r>
         <w:t xml:space="preserve">(</w:t>
       </w:r>
-      <w:hyperlink r:id="rId39">
+      <w:hyperlink r:id="rId40">
         <w:r>
           <w:rPr>
             <w:rStyle w:val="Hyperlink"/>
@@ -4567,8 +4680,8 @@
         </w:pict>
       </w:r>
     </w:p>
-    <w:bookmarkEnd w:id="40"/>
-    <w:bookmarkStart w:id="43" w:name="ia-validation-fine-tuning"/>
+    <w:bookmarkEnd w:id="41"/>
+    <w:bookmarkStart w:id="44" w:name="ia-validation-fine-tuning"/>
     <w:p>
       <w:pPr>
         <w:pStyle w:val="Heading4"/>
@@ -4820,7 +4933,7 @@
       <w:r>
         <w:t xml:space="preserve"> </w:t>
       </w:r>
-      <w:hyperlink r:id="rId41">
+      <w:hyperlink r:id="rId42">
         <w:r>
           <w:rPr>
             <w:rStyle w:val="Hyperlink"/>
@@ -4909,7 +5022,7 @@
       <w:r>
         <w:t xml:space="preserve"> </w:t>
       </w:r>
-      <w:hyperlink r:id="rId42">
+      <w:hyperlink r:id="rId43">
         <w:r>
           <w:rPr>
             <w:rStyle w:val="Hyperlink"/>
@@ -5041,8 +5154,8 @@
         </w:pict>
       </w:r>
     </w:p>
-    <w:bookmarkEnd w:id="43"/>
-    <w:bookmarkStart w:id="46" w:name="data-pipeline-exécuté-résultats-réels"/>
+    <w:bookmarkEnd w:id="44"/>
+    <w:bookmarkStart w:id="47" w:name="data-pipeline-exécuté-résultats-réels"/>
     <w:p>
       <w:pPr>
         <w:pStyle w:val="Heading4"/>
@@ -5347,7 +5460,7 @@
       <w:r>
         <w:t xml:space="preserve"> </w:t>
       </w:r>
-      <w:hyperlink r:id="rId44">
+      <w:hyperlink r:id="rId45">
         <w:r>
           <w:rPr>
             <w:rStyle w:val="Hyperlink"/>
@@ -5364,7 +5477,7 @@
       <w:r>
         <w:t xml:space="preserve"> </w:t>
       </w:r>
-      <w:hyperlink r:id="rId45">
+      <w:hyperlink r:id="rId46">
         <w:r>
           <w:rPr>
             <w:rStyle w:val="Hyperlink"/>
@@ -5419,8 +5532,8 @@
         </w:pict>
       </w:r>
     </w:p>
-    <w:bookmarkEnd w:id="46"/>
-    <w:bookmarkStart w:id="47" w:name="cyber-robustesse-intégrité"/>
+    <w:bookmarkEnd w:id="47"/>
+    <w:bookmarkStart w:id="48" w:name="cyber-robustesse-intégrité"/>
     <w:p>
       <w:pPr>
         <w:pStyle w:val="Heading4"/>
@@ -5821,7 +5934,7 @@
       <w:r>
         <w:t xml:space="preserve"> </w:t>
       </w:r>
-      <w:hyperlink r:id="rId23">
+      <w:hyperlink r:id="rId24">
         <w:r>
           <w:rPr>
             <w:rStyle w:val="Hyperlink"/>
@@ -5837,9 +5950,9 @@
         </w:pict>
       </w:r>
     </w:p>
-    <w:bookmarkEnd w:id="47"/>
     <w:bookmarkEnd w:id="48"/>
-    <w:bookmarkStart w:id="49" w:name="inventaire-des-fichiers"/>
+    <w:bookmarkEnd w:id="49"/>
+    <w:bookmarkStart w:id="50" w:name="inventaire-des-fichiers"/>
     <w:p>
       <w:pPr>
         <w:pStyle w:val="Heading3"/>
@@ -6217,8 +6330,8 @@
         </w:pict>
       </w:r>
     </w:p>
-    <w:bookmarkEnd w:id="49"/>
-    <w:bookmarkStart w:id="50" w:name="auto-évaluation"/>
+    <w:bookmarkEnd w:id="50"/>
+    <w:bookmarkStart w:id="51" w:name="auto-évaluation"/>
     <w:p>
       <w:pPr>
         <w:pStyle w:val="Heading3"/>
@@ -6685,8 +6798,8 @@
         </w:pict>
       </w:r>
     </w:p>
-    <w:bookmarkEnd w:id="50"/>
-    <w:bookmarkStart w:id="51" w:name="axes-damélioration-état"/>
+    <w:bookmarkEnd w:id="51"/>
+    <w:bookmarkStart w:id="52" w:name="axes-damélioration-état"/>
     <w:p>
       <w:pPr>
         <w:pStyle w:val="Heading3"/>
@@ -6943,7 +7056,7 @@
             <w:r>
               <w:t xml:space="preserve">(</w:t>
             </w:r>
-            <w:hyperlink r:id="rId23">
+            <w:hyperlink r:id="rId24">
               <w:r>
                 <w:rPr>
                   <w:rStyle w:val="Hyperlink"/>
@@ -7316,8 +7429,8 @@
         </w:pict>
       </w:r>
     </w:p>
-    <w:bookmarkEnd w:id="51"/>
-    <w:bookmarkStart w:id="54" w:name="limites-connues"/>
+    <w:bookmarkEnd w:id="52"/>
+    <w:bookmarkStart w:id="55" w:name="limites-connues"/>
     <w:p>
       <w:pPr>
         <w:pStyle w:val="Heading3"/>
@@ -7350,7 +7463,7 @@
       <w:r>
         <w:t xml:space="preserve"> </w:t>
       </w:r>
-      <w:hyperlink r:id="rId52">
+      <w:hyperlink r:id="rId53">
         <w:r>
           <w:rPr>
             <w:rStyle w:val="Hyperlink"/>
@@ -7527,7 +7640,7 @@
         </w:rPr>
         <w:t xml:space="preserve"> </w:t>
       </w:r>
-      <w:hyperlink r:id="rId53">
+      <w:hyperlink r:id="rId54">
         <w:r>
           <w:rPr>
             <w:rStyle w:val="Hyperlink"/>
@@ -7558,7 +7671,7 @@
         </w:rPr>
         <w:t xml:space="preserve"> </w:t>
       </w:r>
-      <w:hyperlink r:id="rId22">
+      <w:hyperlink r:id="rId23">
         <w:r>
           <w:rPr>
             <w:rStyle w:val="Hyperlink"/>
@@ -7589,7 +7702,7 @@
         </w:rPr>
         <w:t xml:space="preserve"> </w:t>
       </w:r>
-      <w:hyperlink r:id="rId23">
+      <w:hyperlink r:id="rId24">
         <w:r>
           <w:rPr>
             <w:rStyle w:val="Hyperlink"/>
@@ -7612,10 +7725,10 @@
         <w:br w:type="page"/>
       </w:r>
     </w:p>
-    <w:bookmarkEnd w:id="54"/>
     <w:bookmarkEnd w:id="55"/>
     <w:bookmarkEnd w:id="56"/>
-    <w:bookmarkStart w:id="88" w:name="documentation-technique-déploiement"/>
+    <w:bookmarkEnd w:id="57"/>
+    <w:bookmarkStart w:id="89" w:name="documentation-technique-déploiement"/>
     <w:p>
       <w:pPr>
         <w:pStyle w:val="Heading1"/>
@@ -7624,7 +7737,7 @@
         <w:t xml:space="preserve">3. Documentation technique &amp; déploiement</w:t>
       </w:r>
     </w:p>
-    <w:bookmarkStart w:id="87" w:name="documentation-technique-techcorp-ai"/>
+    <w:bookmarkStart w:id="88" w:name="documentation-technique-techcorp-ai"/>
     <w:p>
       <w:pPr>
         <w:pStyle w:val="Heading2"/>
@@ -7633,7 +7746,7 @@
         <w:t xml:space="preserve">Documentation Technique — TechCorp AI</w:t>
       </w:r>
     </w:p>
-    <w:bookmarkStart w:id="58" w:name="architecture-2"/>
+    <w:bookmarkStart w:id="59" w:name="architecture-2"/>
     <w:p>
       <w:pPr>
         <w:pStyle w:val="Heading3"/>
@@ -7783,7 +7896,7 @@
         <w:t xml:space="preserve">.</w:t>
       </w:r>
     </w:p>
-    <w:bookmarkStart w:id="57" w:name="pourquoi-un-mode-démo"/>
+    <w:bookmarkStart w:id="58" w:name="pourquoi-un-mode-démo"/>
     <w:p>
       <w:pPr>
         <w:pStyle w:val="Heading4"/>
@@ -7873,9 +7986,9 @@
         </w:pict>
       </w:r>
     </w:p>
-    <w:bookmarkEnd w:id="57"/>
     <w:bookmarkEnd w:id="58"/>
-    <w:bookmarkStart w:id="59" w:name="choix-technique-du-serveur-dinférence"/>
+    <w:bookmarkEnd w:id="59"/>
+    <w:bookmarkStart w:id="60" w:name="choix-technique-du-serveur-dinférence"/>
     <w:p>
       <w:pPr>
         <w:pStyle w:val="Heading3"/>
@@ -7976,8 +8089,8 @@
         </w:pict>
       </w:r>
     </w:p>
-    <w:bookmarkEnd w:id="59"/>
-    <w:bookmarkStart w:id="62" w:name="démarrage"/>
+    <w:bookmarkEnd w:id="60"/>
+    <w:bookmarkStart w:id="63" w:name="démarrage"/>
     <w:p>
       <w:pPr>
         <w:pStyle w:val="Heading3"/>
@@ -7986,7 +8099,7 @@
         <w:t xml:space="preserve">3. Démarrage</w:t>
       </w:r>
     </w:p>
-    <w:bookmarkStart w:id="60" w:name="option-a-tout-en-un-recommandé"/>
+    <w:bookmarkStart w:id="61" w:name="option-a-tout-en-un-recommandé"/>
     <w:p>
       <w:pPr>
         <w:pStyle w:val="Heading4"/>
@@ -8044,8 +8157,8 @@
         <w:t xml:space="preserve">Fonctionne immédiatement en mode démo.</w:t>
       </w:r>
     </w:p>
-    <w:bookmarkEnd w:id="60"/>
-    <w:bookmarkStart w:id="61" w:name="option-b-manuel"/>
+    <w:bookmarkEnd w:id="61"/>
+    <w:bookmarkStart w:id="62" w:name="option-b-manuel"/>
     <w:p>
       <w:pPr>
         <w:pStyle w:val="Heading4"/>
@@ -8177,9 +8290,9 @@
         </w:pict>
       </w:r>
     </w:p>
-    <w:bookmarkEnd w:id="61"/>
     <w:bookmarkEnd w:id="62"/>
-    <w:bookmarkStart w:id="66" w:name="activer-le-vrai-modèle-phi-3.5-financial"/>
+    <w:bookmarkEnd w:id="63"/>
+    <w:bookmarkStart w:id="67" w:name="activer-le-vrai-modèle-phi-3.5-financial"/>
     <w:p>
       <w:pPr>
         <w:pStyle w:val="Heading3"/>
@@ -8188,7 +8301,7 @@
         <w:t xml:space="preserve">4. Activer le vrai modèle Phi-3.5-Financial</w:t>
       </w:r>
     </w:p>
-    <w:bookmarkStart w:id="63" w:name="helper-automatique-windows"/>
+    <w:bookmarkStart w:id="64" w:name="helper-automatique-windows"/>
     <w:p>
       <w:pPr>
         <w:pStyle w:val="Heading4"/>
@@ -8244,8 +8357,8 @@
         <w:t xml:space="preserve">ps1</w:t>
       </w:r>
     </w:p>
-    <w:bookmarkEnd w:id="63"/>
-    <w:bookmarkStart w:id="64" w:name="manuel"/>
+    <w:bookmarkEnd w:id="64"/>
+    <w:bookmarkStart w:id="65" w:name="manuel"/>
     <w:p>
       <w:pPr>
         <w:pStyle w:val="Heading4"/>
@@ -8379,8 +8492,8 @@
         <w:t xml:space="preserve">.</w:t>
       </w:r>
     </w:p>
-    <w:bookmarkEnd w:id="64"/>
-    <w:bookmarkStart w:id="65" w:name="modèles-alternatifs-légers"/>
+    <w:bookmarkEnd w:id="65"/>
+    <w:bookmarkStart w:id="66" w:name="modèles-alternatifs-légers"/>
     <w:p>
       <w:pPr>
         <w:pStyle w:val="Heading4"/>
@@ -8491,9 +8604,9 @@
         </w:pict>
       </w:r>
     </w:p>
-    <w:bookmarkEnd w:id="65"/>
     <w:bookmarkEnd w:id="66"/>
-    <w:bookmarkStart w:id="69" w:name="bis.-déploiement-docker-reproductible"/>
+    <w:bookmarkEnd w:id="67"/>
+    <w:bookmarkStart w:id="70" w:name="bis.-déploiement-docker-reproductible"/>
     <w:p>
       <w:pPr>
         <w:pStyle w:val="Heading3"/>
@@ -8622,7 +8735,7 @@
       <w:r>
         <w:t xml:space="preserve"> </w:t>
       </w:r>
-      <w:hyperlink r:id="rId67">
+      <w:hyperlink r:id="rId68">
         <w:r>
           <w:rPr>
             <w:rStyle w:val="Hyperlink"/>
@@ -8636,7 +8749,7 @@
       <w:r>
         <w:t xml:space="preserve"> </w:t>
       </w:r>
-      <w:hyperlink r:id="rId68">
+      <w:hyperlink r:id="rId69">
         <w:r>
           <w:rPr>
             <w:rStyle w:val="Hyperlink"/>
@@ -8655,8 +8768,8 @@
         </w:pict>
       </w:r>
     </w:p>
-    <w:bookmarkEnd w:id="69"/>
-    <w:bookmarkStart w:id="72" w:name="api-reference"/>
+    <w:bookmarkEnd w:id="70"/>
+    <w:bookmarkStart w:id="73" w:name="api-reference"/>
     <w:p>
       <w:pPr>
         <w:pStyle w:val="Heading3"/>
@@ -8891,7 +9004,7 @@
         </w:tc>
       </w:tr>
     </w:tbl>
-    <w:bookmarkStart w:id="70" w:name="exemple-v1chat"/>
+    <w:bookmarkStart w:id="71" w:name="exemple-v1chat"/>
     <w:p>
       <w:pPr>
         <w:pStyle w:val="Heading4"/>
@@ -9246,8 +9359,8 @@
         <w:t xml:space="preserve">data: {"delta": "...", "done": false, "mode": "demo"}</w:t>
       </w:r>
     </w:p>
-    <w:bookmarkEnd w:id="70"/>
-    <w:bookmarkStart w:id="71" w:name="Xee2b2c7b3a20917cee0df0c1114ba5caa5b733a"/>
+    <w:bookmarkEnd w:id="71"/>
+    <w:bookmarkStart w:id="72" w:name="Xee2b2c7b3a20917cee0df0c1114ba5caa5b733a"/>
     <w:p>
       <w:pPr>
         <w:pStyle w:val="Heading4"/>
@@ -9588,9 +9701,9 @@
         </w:pict>
       </w:r>
     </w:p>
-    <w:bookmarkEnd w:id="71"/>
     <w:bookmarkEnd w:id="72"/>
-    <w:bookmarkStart w:id="77" w:name="mission-rd-fine-tuning-médical-lora"/>
+    <w:bookmarkEnd w:id="73"/>
+    <w:bookmarkStart w:id="78" w:name="mission-rd-fine-tuning-médical-lora"/>
     <w:p>
       <w:pPr>
         <w:pStyle w:val="Heading3"/>
@@ -9599,7 +9712,7 @@
         <w:t xml:space="preserve">6. Mission R&amp;D — Fine-tuning médical (LoRA)</w:t>
       </w:r>
     </w:p>
-    <w:bookmarkStart w:id="73" w:name="a-préparer-les-données-data"/>
+    <w:bookmarkStart w:id="74" w:name="a-préparer-les-données-data"/>
     <w:p>
       <w:pPr>
         <w:pStyle w:val="Heading4"/>
@@ -9673,8 +9786,8 @@
         <w:t xml:space="preserve"># → medical_dataset_clean.json + rapport de qualité</w:t>
       </w:r>
     </w:p>
-    <w:bookmarkEnd w:id="73"/>
-    <w:bookmarkStart w:id="75" w:name="b-fine-tuning-ia-gpu-google-colab-pro"/>
+    <w:bookmarkEnd w:id="74"/>
+    <w:bookmarkStart w:id="76" w:name="b-fine-tuning-ia-gpu-google-colab-pro"/>
     <w:p>
       <w:pPr>
         <w:pStyle w:val="Heading4"/>
@@ -9697,7 +9810,7 @@
       <w:r>
         <w:t xml:space="preserve"> </w:t>
       </w:r>
-      <w:hyperlink r:id="rId74">
+      <w:hyperlink r:id="rId75">
         <w:r>
           <w:rPr>
             <w:rStyle w:val="Hyperlink"/>
@@ -9884,8 +9997,8 @@
         <w:t xml:space="preserve"> fine_tuning/medical_model_lora</w:t>
       </w:r>
     </w:p>
-    <w:bookmarkEnd w:id="75"/>
-    <w:bookmarkStart w:id="76" w:name="X18cd3c05d5e0c9d6307f1eb10f38ed91b9e9a6b"/>
+    <w:bookmarkEnd w:id="76"/>
+    <w:bookmarkStart w:id="77" w:name="X18cd3c05d5e0c9d6307f1eb10f38ed91b9e9a6b"/>
     <w:p>
       <w:pPr>
         <w:pStyle w:val="Heading4"/>
@@ -9996,9 +10109,9 @@
         </w:pict>
       </w:r>
     </w:p>
-    <w:bookmarkEnd w:id="76"/>
     <w:bookmarkEnd w:id="77"/>
-    <w:bookmarkStart w:id="81" w:name="mission-cyber-audit-de-sécurité"/>
+    <w:bookmarkEnd w:id="78"/>
+    <w:bookmarkStart w:id="82" w:name="mission-cyber-audit-de-sécurité"/>
     <w:p>
       <w:pPr>
         <w:pStyle w:val="Heading3"/>
@@ -10007,7 +10120,7 @@
         <w:t xml:space="preserve">7. Mission CYBER — Audit de sécurité</w:t>
       </w:r>
     </w:p>
-    <w:bookmarkStart w:id="78" w:name="a-robustesse-du-modèle"/>
+    <w:bookmarkStart w:id="79" w:name="a-robustesse-du-modèle"/>
     <w:p>
       <w:pPr>
         <w:pStyle w:val="Heading4"/>
@@ -10051,8 +10164,8 @@
         <w:t xml:space="preserve"># → security_audit_report.json   (résultat obtenu : 10/11, 91 %)</w:t>
       </w:r>
     </w:p>
-    <w:bookmarkEnd w:id="78"/>
-    <w:bookmarkStart w:id="80" w:name="X67b8718704c9bc1554678b5ffce6852a7f01cc2"/>
+    <w:bookmarkEnd w:id="79"/>
+    <w:bookmarkStart w:id="81" w:name="X67b8718704c9bc1554678b5ffce6852a7f01cc2"/>
     <w:p>
       <w:pPr>
         <w:pStyle w:val="Heading4"/>
@@ -10172,7 +10285,7 @@
       <w:r>
         <w:t xml:space="preserve"> </w:t>
       </w:r>
-      <w:hyperlink r:id="rId79">
+      <w:hyperlink r:id="rId80">
         <w:r>
           <w:rPr>
             <w:rStyle w:val="Hyperlink"/>
@@ -10184,9 +10297,9 @@
         <w:t xml:space="preserve">.</w:t>
       </w:r>
     </w:p>
-    <w:bookmarkEnd w:id="80"/>
     <w:bookmarkEnd w:id="81"/>
-    <w:bookmarkStart w:id="82" w:name="mission-ia-tests-de-performance"/>
+    <w:bookmarkEnd w:id="82"/>
+    <w:bookmarkStart w:id="83" w:name="mission-ia-tests-de-performance"/>
     <w:p>
       <w:pPr>
         <w:pStyle w:val="Heading3"/>
@@ -10237,8 +10350,8 @@
         </w:pict>
       </w:r>
     </w:p>
-    <w:bookmarkEnd w:id="82"/>
-    <w:bookmarkStart w:id="83" w:name="X00ca8af4d9ca47fb73b0afa836d6edd1cc64eb5"/>
+    <w:bookmarkEnd w:id="83"/>
+    <w:bookmarkStart w:id="84" w:name="X00ca8af4d9ca47fb73b0afa836d6edd1cc64eb5"/>
     <w:p>
       <w:pPr>
         <w:pStyle w:val="Heading3"/>
@@ -10448,8 +10561,8 @@
         </w:pict>
       </w:r>
     </w:p>
-    <w:bookmarkEnd w:id="83"/>
-    <w:bookmarkStart w:id="84" w:name="optimisation-des-performances"/>
+    <w:bookmarkEnd w:id="84"/>
+    <w:bookmarkStart w:id="85" w:name="optimisation-des-performances"/>
     <w:p>
       <w:pPr>
         <w:pStyle w:val="Heading3"/>
@@ -10676,8 +10789,8 @@
         </w:pict>
       </w:r>
     </w:p>
-    <w:bookmarkEnd w:id="84"/>
-    <w:bookmarkStart w:id="85" w:name="dépannage"/>
+    <w:bookmarkEnd w:id="85"/>
+    <w:bookmarkStart w:id="86" w:name="dépannage"/>
     <w:p>
       <w:pPr>
         <w:pStyle w:val="Heading3"/>
@@ -10933,8 +11046,8 @@
         </w:pict>
       </w:r>
     </w:p>
-    <w:bookmarkEnd w:id="85"/>
-    <w:bookmarkStart w:id="86" w:name="structure-du-projet"/>
+    <w:bookmarkEnd w:id="86"/>
+    <w:bookmarkStart w:id="87" w:name="structure-du-projet"/>
     <w:p>
       <w:pPr>
         <w:pStyle w:val="Heading3"/>
@@ -11175,10 +11288,10 @@
         <w:br w:type="page"/>
       </w:r>
     </w:p>
-    <w:bookmarkEnd w:id="86"/>
     <w:bookmarkEnd w:id="87"/>
     <w:bookmarkEnd w:id="88"/>
-    <w:bookmarkStart w:id="103" w:name="sécurité-validation-dintégrité-cyber"/>
+    <w:bookmarkEnd w:id="89"/>
+    <w:bookmarkStart w:id="104" w:name="sécurité-validation-dintégrité-cyber"/>
     <w:p>
       <w:pPr>
         <w:pStyle w:val="Heading1"/>
@@ -11187,7 +11300,7 @@
         <w:t xml:space="preserve">4. Sécurité &amp; validation d’intégrité (CYBER)</w:t>
       </w:r>
     </w:p>
-    <w:bookmarkStart w:id="102" w:name="Xd26edda8b8d778da44aa71934b0eff68964efa7"/>
+    <w:bookmarkStart w:id="103" w:name="Xd26edda8b8d778da44aa71934b0eff68964efa7"/>
     <w:p>
       <w:pPr>
         <w:pStyle w:val="Heading2"/>
@@ -11302,7 +11415,7 @@
         </w:pict>
       </w:r>
     </w:p>
-    <w:bookmarkStart w:id="89" w:name="modèle-de-menace"/>
+    <w:bookmarkStart w:id="90" w:name="modèle-de-menace"/>
     <w:p>
       <w:pPr>
         <w:pStyle w:val="Heading3"/>
@@ -11596,8 +11709,8 @@
         </w:pict>
       </w:r>
     </w:p>
-    <w:bookmarkEnd w:id="89"/>
-    <w:bookmarkStart w:id="92" w:name="outil-mis-en-place"/>
+    <w:bookmarkEnd w:id="90"/>
+    <w:bookmarkStart w:id="93" w:name="outil-mis-en-place"/>
     <w:p>
       <w:pPr>
         <w:pStyle w:val="Heading3"/>
@@ -11610,7 +11723,7 @@
       <w:pPr>
         <w:pStyle w:val="FirstParagraph"/>
       </w:pPr>
-      <w:hyperlink r:id="rId90">
+      <w:hyperlink r:id="rId91">
         <w:r>
           <w:rPr>
             <w:rStyle w:val="VerbatimChar"/>
@@ -11768,7 +11881,7 @@
         <w:t xml:space="preserve">--all</w:t>
       </w:r>
     </w:p>
-    <w:bookmarkStart w:id="91" w:name="ce-que-fait---verify"/>
+    <w:bookmarkStart w:id="92" w:name="ce-que-fait---verify"/>
     <w:p>
       <w:pPr>
         <w:pStyle w:val="Heading4"/>
@@ -11897,9 +12010,9 @@
         </w:pict>
       </w:r>
     </w:p>
-    <w:bookmarkEnd w:id="91"/>
     <w:bookmarkEnd w:id="92"/>
-    <w:bookmarkStart w:id="95" w:name="résultat-réel-de-laudit"/>
+    <w:bookmarkEnd w:id="93"/>
+    <w:bookmarkStart w:id="96" w:name="résultat-réel-de-laudit"/>
     <w:p>
       <w:pPr>
         <w:pStyle w:val="Heading3"/>
@@ -11908,7 +12021,7 @@
         <w:t xml:space="preserve">3. Résultat réel de l’audit</w:t>
       </w:r>
     </w:p>
-    <w:bookmarkStart w:id="93" w:name="intégrité-des-fichiers"/>
+    <w:bookmarkStart w:id="94" w:name="intégrité-des-fichiers"/>
     <w:p>
       <w:pPr>
         <w:pStyle w:val="Heading4"/>
@@ -11946,8 +12059,8 @@
         <w:t xml:space="preserve">✅ INTÈGRE — aucun écart détecté.</w:t>
       </w:r>
     </w:p>
-    <w:bookmarkEnd w:id="93"/>
-    <w:bookmarkStart w:id="94" w:name="X53ded059272322ace49fc3a597c75232b06d1a9"/>
+    <w:bookmarkEnd w:id="94"/>
+    <w:bookmarkStart w:id="95" w:name="X53ded059272322ace49fc3a597c75232b06d1a9"/>
     <w:p>
       <w:pPr>
         <w:pStyle w:val="Heading4"/>
@@ -12309,9 +12422,9 @@
         </w:pict>
       </w:r>
     </w:p>
-    <w:bookmarkEnd w:id="94"/>
     <w:bookmarkEnd w:id="95"/>
-    <w:bookmarkStart w:id="98" w:name="checklist-de-reprise-dun-projet-suspect"/>
+    <w:bookmarkEnd w:id="96"/>
+    <w:bookmarkStart w:id="99" w:name="checklist-de-reprise-dun-projet-suspect"/>
     <w:p>
       <w:pPr>
         <w:pStyle w:val="Heading3"/>
@@ -12607,7 +12720,7 @@
         <w:t xml:space="preserve">)</w:t>
       </w:r>
     </w:p>
-    <w:bookmarkStart w:id="97" w:name="revue-rapide-réalisée-sur-ce-projet"/>
+    <w:bookmarkStart w:id="98" w:name="revue-rapide-réalisée-sur-ce-projet"/>
     <w:p>
       <w:pPr>
         <w:pStyle w:val="Heading4"/>
@@ -12701,7 +12814,7 @@
       <w:r>
         <w:t xml:space="preserve">(</w:t>
       </w:r>
-      <w:hyperlink r:id="rId96">
+      <w:hyperlink r:id="rId97">
         <w:r>
           <w:rPr>
             <w:rStyle w:val="Hyperlink"/>
@@ -12715,7 +12828,7 @@
       <w:r>
         <w:t xml:space="preserve"> </w:t>
       </w:r>
-      <w:hyperlink r:id="rId90">
+      <w:hyperlink r:id="rId91">
         <w:r>
           <w:rPr>
             <w:rStyle w:val="Hyperlink"/>
@@ -12836,9 +12949,9 @@
         </w:pict>
       </w:r>
     </w:p>
-    <w:bookmarkEnd w:id="97"/>
     <w:bookmarkEnd w:id="98"/>
-    <w:bookmarkStart w:id="101" w:name="X201e791cb55a4fb3d30778f581178ecf55cb52d"/>
+    <w:bookmarkEnd w:id="99"/>
+    <w:bookmarkStart w:id="102" w:name="X201e791cb55a4fb3d30778f581178ecf55cb52d"/>
     <w:p>
       <w:pPr>
         <w:pStyle w:val="Heading3"/>
@@ -12965,7 +13078,7 @@
       <w:r>
         <w:t xml:space="preserve"> </w:t>
       </w:r>
-      <w:hyperlink r:id="rId99">
+      <w:hyperlink r:id="rId100">
         <w:r>
           <w:rPr>
             <w:rStyle w:val="Hyperlink"/>
@@ -13095,7 +13208,7 @@
         </w:rPr>
         <w:t xml:space="preserve"> </w:t>
       </w:r>
-      <w:hyperlink r:id="rId100">
+      <w:hyperlink r:id="rId101">
         <w:r>
           <w:rPr>
             <w:rStyle w:val="Hyperlink"/>
@@ -13125,10 +13238,10 @@
         <w:br w:type="page"/>
       </w:r>
     </w:p>
-    <w:bookmarkEnd w:id="101"/>
     <w:bookmarkEnd w:id="102"/>
     <w:bookmarkEnd w:id="103"/>
-    <w:bookmarkStart w:id="104" w:name="data-rapport-de-qualité-du-dataset"/>
+    <w:bookmarkEnd w:id="104"/>
+    <w:bookmarkStart w:id="105" w:name="data-rapport-de-qualité-du-dataset"/>
     <w:p>
       <w:pPr>
         <w:pStyle w:val="Heading1"/>
@@ -13330,8 +13443,8 @@
         <w:br w:type="page"/>
       </w:r>
     </w:p>
-    <w:bookmarkEnd w:id="104"/>
-    <w:bookmarkStart w:id="111" w:name="ia-rapport-de-fine-tuning-lora"/>
+    <w:bookmarkEnd w:id="105"/>
+    <w:bookmarkStart w:id="112" w:name="ia-rapport-de-fine-tuning-lora"/>
     <w:p>
       <w:pPr>
         <w:pStyle w:val="Heading1"/>
@@ -13340,7 +13453,7 @@
         <w:t xml:space="preserve">6. IA — Rapport de fine-tuning LoRA</w:t>
       </w:r>
     </w:p>
-    <w:bookmarkStart w:id="110" w:name="Xbcea5002b716d748bd6957c8ead8b2249f284de"/>
+    <w:bookmarkStart w:id="111" w:name="Xbcea5002b716d748bd6957c8ead8b2249f284de"/>
     <w:p>
       <w:pPr>
         <w:pStyle w:val="Heading2"/>
@@ -13410,7 +13523,7 @@
         <w:t xml:space="preserve">.</w:t>
       </w:r>
     </w:p>
-    <w:bookmarkStart w:id="105" w:name="configuration"/>
+    <w:bookmarkStart w:id="106" w:name="configuration"/>
     <w:p>
       <w:pPr>
         <w:pStyle w:val="Heading3"/>
@@ -13687,8 +13800,8 @@
         </w:tc>
       </w:tr>
     </w:tbl>
-    <w:bookmarkEnd w:id="105"/>
-    <w:bookmarkStart w:id="106" w:name="données"/>
+    <w:bookmarkEnd w:id="106"/>
+    <w:bookmarkStart w:id="107" w:name="données"/>
     <w:p>
       <w:pPr>
         <w:pStyle w:val="Heading3"/>
@@ -13732,8 +13845,8 @@
         <w:t xml:space="preserve">).</w:t>
       </w:r>
     </w:p>
-    <w:bookmarkEnd w:id="106"/>
-    <w:bookmarkStart w:id="107" w:name="exemple-de-génération-même-prompt"/>
+    <w:bookmarkEnd w:id="107"/>
+    <w:bookmarkStart w:id="108" w:name="exemple-de-génération-même-prompt"/>
     <w:p>
       <w:pPr>
         <w:pStyle w:val="Heading3"/>
@@ -13864,8 +13977,8 @@
         <w:t xml:space="preserve">My body is still developing very well but it has been difficult to get rid of this infection without trying again until we can make some changes in the blood circulation which are needed, so at first that's not something you need when getting into contact with your family or friends from hospital because they</w:t>
       </w:r>
     </w:p>
-    <w:bookmarkEnd w:id="107"/>
-    <w:bookmarkStart w:id="108" w:name="artefacts-produits"/>
+    <w:bookmarkEnd w:id="108"/>
+    <w:bookmarkStart w:id="109" w:name="artefacts-produits"/>
     <w:p>
       <w:pPr>
         <w:pStyle w:val="Heading3"/>
@@ -13916,8 +14029,8 @@
         <w:t xml:space="preserve">— configuration LoRA</w:t>
       </w:r>
     </w:p>
-    <w:bookmarkEnd w:id="108"/>
-    <w:bookmarkStart w:id="109" w:name="note"/>
+    <w:bookmarkEnd w:id="109"/>
+    <w:bookmarkStart w:id="110" w:name="note"/>
     <w:p>
       <w:pPr>
         <w:pStyle w:val="Heading3"/>
@@ -13968,9 +14081,9 @@
         <w:t xml:space="preserve">grand (Phi-2 / Phi-3.5) et plus d’exemples via le notebook Colab.</w:t>
       </w:r>
     </w:p>
-    <w:bookmarkEnd w:id="109"/>
     <w:bookmarkEnd w:id="110"/>
     <w:bookmarkEnd w:id="111"/>
+    <w:bookmarkEnd w:id="112"/>
     <w:sectPr>
       <w:footnotePr>
         <w:numRestart w:val="eachSect"/>

</xml_diff>